<commit_message>
Game fully finished + Game design document updated
</commit_message>
<xml_diff>
--- a/Opdracht-2/Game Design Document.docx
+++ b/Opdracht-2/Game Design Document.docx
@@ -438,7 +438,21 @@
                       <w:i/>
                       <w:color w:val="B7B7B7"/>
                     </w:rPr>
+                    <w:t xml:space="preserve">2D </w:t>
+                  </w:r>
+                  <w:r>
+                    <w:rPr>
+                      <w:i/>
+                      <w:color w:val="B7B7B7"/>
+                    </w:rPr>
                     <w:t>Side view</w:t>
+                  </w:r>
+                  <w:r>
+                    <w:rPr>
+                      <w:i/>
+                      <w:color w:val="B7B7B7"/>
+                    </w:rPr>
+                    <w:t xml:space="preserve"> endless runner</w:t>
                   </w:r>
                 </w:p>
               </w:tc>
@@ -1103,14 +1117,7 @@
                       <w:i/>
                       <w:color w:val="B7B7B7"/>
                     </w:rPr>
-                    <w:t>Dodge  ob</w:t>
-                  </w:r>
-                  <w:r>
-                    <w:rPr>
-                      <w:i/>
-                      <w:color w:val="B7B7B7"/>
-                    </w:rPr>
-                    <w:t>stacles</w:t>
+                    <w:t>Dodge obstacles</w:t>
                   </w:r>
                   <w:r>
                     <w:rPr>
@@ -1300,7 +1307,28 @@
                       <w:i/>
                       <w:color w:val="B7B7B7"/>
                     </w:rPr>
-                    <w:t>Jump sound effect and game over sound effect</w:t>
+                    <w:t>Jump sound effect</w:t>
+                  </w:r>
+                  <w:r>
+                    <w:rPr>
+                      <w:i/>
+                      <w:color w:val="B7B7B7"/>
+                    </w:rPr>
+                    <w:t>,</w:t>
+                  </w:r>
+                  <w:r>
+                    <w:rPr>
+                      <w:i/>
+                      <w:color w:val="B7B7B7"/>
+                    </w:rPr>
+                    <w:t xml:space="preserve"> game over sound effect</w:t>
+                  </w:r>
+                  <w:r>
+                    <w:rPr>
+                      <w:i/>
+                      <w:color w:val="B7B7B7"/>
+                    </w:rPr>
+                    <w:t>, death sound effect, Victory sound effect</w:t>
                   </w:r>
                 </w:p>
                 <w:p>
@@ -1402,14 +1430,22 @@
                       <w:i/>
                       <w:color w:val="B7B7B7"/>
                     </w:rPr>
-                    <w:t>When hitting ob</w:t>
-                  </w:r>
-                  <w:r>
-                    <w:rPr>
-                      <w:i/>
-                      <w:color w:val="B7B7B7"/>
-                    </w:rPr>
-                    <w:t>stacle</w:t>
+                    <w:t xml:space="preserve">When hitting </w:t>
+                  </w:r>
+                  <w:r>
+                    <w:rPr>
+                      <w:i/>
+                      <w:color w:val="B7B7B7"/>
+                    </w:rPr>
+                    <w:t xml:space="preserve">an obstacle, the player </w:t>
+                  </w:r>
+                  <w:r>
+                    <w:rPr>
+                      <w:rFonts w:asciiTheme="minorHAnsi" w:hAnsiTheme="minorHAnsi"/>
+                      <w:i/>
+                      <w:color w:val="B7B7B7"/>
+                    </w:rPr>
+                    <w:t>disappears, and an exploding effect is shown</w:t>
                   </w:r>
                 </w:p>
                 <w:p>
@@ -2348,7 +2384,21 @@
                       <w:i/>
                       <w:color w:val="B7B7B7"/>
                     </w:rPr>
-                    <w:t>As long as the player continues to dodge</w:t>
+                    <w:t>t</w:t>
+                  </w:r>
+                  <w:r>
+                    <w:rPr>
+                      <w:i/>
+                      <w:color w:val="B7B7B7"/>
+                    </w:rPr>
+                    <w:t>he player continues to dodge</w:t>
+                  </w:r>
+                  <w:r>
+                    <w:rPr>
+                      <w:i/>
+                      <w:color w:val="B7B7B7"/>
+                    </w:rPr>
+                    <w:t xml:space="preserve"> obstacles</w:t>
                   </w:r>
                 </w:p>
               </w:tc>
@@ -2647,7 +2697,6 @@
             <w:bookmarkStart w:id="7" w:name="_s9u68ock28th" w:colFirst="0" w:colLast="0"/>
             <w:bookmarkEnd w:id="7"/>
             <w:r>
-              <w:lastRenderedPageBreak/>
               <w:t>6</w:t>
             </w:r>
           </w:p>
@@ -2754,7 +2803,129 @@
                       <w:i/>
                       <w:color w:val="B7B7B7"/>
                     </w:rPr>
-                    <w:t>You’ll be able to press replay,  And also see current and highest score.</w:t>
+                    <w:t>You’ll be able to press replay</w:t>
+                  </w:r>
+                  <w:r>
+                    <w:rPr>
+                      <w:i/>
+                      <w:color w:val="B7B7B7"/>
+                    </w:rPr>
+                    <w:t xml:space="preserve"> to play again in game over and victory screen.</w:t>
+                  </w:r>
+                </w:p>
+                <w:p>
+                  <w:pPr>
+                    <w:widowControl w:val="0"/>
+                    <w:spacing w:line="240" w:lineRule="auto"/>
+                    <w:rPr>
+                      <w:i/>
+                      <w:color w:val="B7B7B7"/>
+                    </w:rPr>
+                  </w:pPr>
+                  <w:r>
+                    <w:rPr>
+                      <w:i/>
+                      <w:color w:val="B7B7B7"/>
+                    </w:rPr>
+                    <w:t xml:space="preserve"> </w:t>
+                  </w:r>
+                  <w:r>
+                    <w:rPr>
+                      <w:i/>
+                      <w:color w:val="B7B7B7"/>
+                    </w:rPr>
+                    <w:t>You’ll be able to</w:t>
+                  </w:r>
+                  <w:r>
+                    <w:rPr>
+                      <w:i/>
+                      <w:color w:val="B7B7B7"/>
+                    </w:rPr>
+                    <w:t xml:space="preserve"> see </w:t>
+                  </w:r>
+                  <w:r>
+                    <w:rPr>
+                      <w:i/>
+                      <w:color w:val="B7B7B7"/>
+                    </w:rPr>
+                    <w:t>the current</w:t>
+                  </w:r>
+                  <w:r>
+                    <w:rPr>
+                      <w:i/>
+                      <w:color w:val="B7B7B7"/>
+                    </w:rPr>
+                    <w:t xml:space="preserve"> </w:t>
+                  </w:r>
+                  <w:r>
+                    <w:rPr>
+                      <w:i/>
+                      <w:color w:val="B7B7B7"/>
+                    </w:rPr>
+                    <w:t xml:space="preserve">and </w:t>
+                  </w:r>
+                  <w:r>
+                    <w:rPr>
+                      <w:i/>
+                      <w:color w:val="B7B7B7"/>
+                    </w:rPr>
+                    <w:t>highest score.</w:t>
+                  </w:r>
+                  <w:r>
+                    <w:rPr>
+                      <w:i/>
+                      <w:color w:val="B7B7B7"/>
+                    </w:rPr>
+                    <w:br/>
+                    <w:t>The game gets harder as long as you stay alive.</w:t>
+                  </w:r>
+                </w:p>
+                <w:p>
+                  <w:pPr>
+                    <w:widowControl w:val="0"/>
+                    <w:spacing w:line="240" w:lineRule="auto"/>
+                    <w:rPr>
+                      <w:i/>
+                      <w:color w:val="B7B7B7"/>
+                    </w:rPr>
+                  </w:pPr>
+                  <w:r>
+                    <w:rPr>
+                      <w:i/>
+                      <w:color w:val="B7B7B7"/>
+                    </w:rPr>
+                    <w:t>There will be a button to view the instructions.</w:t>
+                  </w:r>
+                </w:p>
+                <w:p>
+                  <w:pPr>
+                    <w:widowControl w:val="0"/>
+                    <w:spacing w:line="240" w:lineRule="auto"/>
+                    <w:rPr>
+                      <w:i/>
+                      <w:color w:val="B7B7B7"/>
+                    </w:rPr>
+                  </w:pPr>
+                  <w:r>
+                    <w:rPr>
+                      <w:i/>
+                      <w:color w:val="B7B7B7"/>
+                    </w:rPr>
+                    <w:t xml:space="preserve">Victory screen played when you reach a certain </w:t>
+                  </w:r>
+                  <w:r>
+                    <w:rPr>
+                      <w:i/>
+                      <w:color w:val="B7B7B7"/>
+                    </w:rPr>
+                    <w:t>number</w:t>
+                  </w:r>
+                  <w:r>
+                    <w:rPr>
+                      <w:i/>
+                      <w:color w:val="B7B7B7"/>
+                    </w:rPr>
+                    <w:t xml:space="preserve"> of points.</w:t>
                   </w:r>
                 </w:p>
                 <w:p>
@@ -3640,7 +3811,21 @@
                       <w:i/>
                       <w:color w:val="B7B7B7"/>
                     </w:rPr>
-                    <w:t>Making the The UI and working buttons to be able to start and replay game</w:t>
+                    <w:t xml:space="preserve">Making </w:t>
+                  </w:r>
+                  <w:r>
+                    <w:rPr>
+                      <w:i/>
+                      <w:color w:val="B7B7B7"/>
+                    </w:rPr>
+                    <w:t>t</w:t>
+                  </w:r>
+                  <w:r>
+                    <w:rPr>
+                      <w:i/>
+                      <w:color w:val="B7B7B7"/>
+                    </w:rPr>
+                    <w:t>he UI and working buttons to be able to start and replay game</w:t>
                   </w:r>
                 </w:p>
               </w:tc>
@@ -4066,12 +4251,7 @@
                 </w:tcPr>
                 <w:p>
                   <w:pPr>
-                    <w:pStyle w:val="ListParagraph"/>
                     <w:widowControl w:val="0"/>
-                    <w:numPr>
-                      <w:ilvl w:val="0"/>
-                      <w:numId w:val="2"/>
-                    </w:numPr>
                     <w:spacing w:line="240" w:lineRule="auto"/>
                     <w:rPr>
                       <w:i/>
@@ -4083,22 +4263,14 @@
                       <w:i/>
                       <w:color w:val="B7B7B7"/>
                     </w:rPr>
-                    <w:t xml:space="preserve">Higher </w:t>
-                  </w:r>
-                  <w:r>
-                    <w:rPr>
-                      <w:rFonts w:asciiTheme="minorHAnsi" w:hAnsiTheme="minorHAnsi"/>
-                      <w:i/>
-                      <w:color w:val="B7B7B7"/>
-                    </w:rPr>
-                    <w:t xml:space="preserve">difficulty </w:t>
-                  </w:r>
-                  <w:r>
-                    <w:rPr>
-                      <w:i/>
-                      <w:color w:val="B7B7B7"/>
-                    </w:rPr>
-                    <w:t>curve</w:t>
+                    <w:t xml:space="preserve">        -</w:t>
+                  </w:r>
+                  <w:r>
+                    <w:rPr>
+                      <w:i/>
+                      <w:color w:val="B7B7B7"/>
+                    </w:rPr>
+                    <w:t>Game over and back to menu screen</w:t>
                   </w:r>
                 </w:p>
                 <w:p>
@@ -4120,7 +4292,59 @@
                       <w:i/>
                       <w:color w:val="B7B7B7"/>
                     </w:rPr>
-                    <w:t>Game over and back to menu screen</w:t>
+                    <w:t xml:space="preserve">View the </w:t>
+                  </w:r>
+                  <w:r>
+                    <w:rPr>
+                      <w:rFonts w:asciiTheme="minorHAnsi" w:hAnsiTheme="minorHAnsi"/>
+                      <w:i/>
+                      <w:color w:val="B7B7B7"/>
+                    </w:rPr>
+                    <w:t>instructions</w:t>
+                  </w:r>
+                  <w:r>
+                    <w:rPr>
+                      <w:rFonts w:asciiTheme="minorHAnsi" w:hAnsiTheme="minorHAnsi"/>
+                      <w:i/>
+                      <w:color w:val="B7B7B7"/>
+                    </w:rPr>
+                    <w:t xml:space="preserve"> button and screen</w:t>
+                  </w:r>
+                </w:p>
+                <w:p>
+                  <w:pPr>
+                    <w:pStyle w:val="ListParagraph"/>
+                    <w:widowControl w:val="0"/>
+                    <w:numPr>
+                      <w:ilvl w:val="0"/>
+                      <w:numId w:val="2"/>
+                    </w:numPr>
+                    <w:spacing w:line="240" w:lineRule="auto"/>
+                    <w:rPr>
+                      <w:i/>
+                      <w:color w:val="B7B7B7"/>
+                    </w:rPr>
+                  </w:pPr>
+                  <w:r>
+                    <w:rPr>
+                      <w:i/>
+                      <w:color w:val="B7B7B7"/>
+                    </w:rPr>
+                    <w:t xml:space="preserve">Victory screen when you reach a certain </w:t>
+                  </w:r>
+                  <w:r>
+                    <w:rPr>
+                      <w:i/>
+                      <w:color w:val="B7B7B7"/>
+                    </w:rPr>
+                    <w:t>number</w:t>
+                  </w:r>
+                  <w:r>
+                    <w:rPr>
+                      <w:i/>
+                      <w:color w:val="B7B7B7"/>
+                    </w:rPr>
+                    <w:t xml:space="preserve"> of points</w:t>
                   </w:r>
                 </w:p>
               </w:tc>

</xml_diff>